<commit_message>
add PWA manifest, icons, and mobile meta tags
</commit_message>
<xml_diff>
--- a/restaurant-setup-guide.docx
+++ b/restaurant-setup-guide.docx
@@ -99,12 +99,6 @@
         <w:gridCol w:w="1283"/>
       </w:tblGrid>
       <w:tr>
-        <w:tblPrEx>
-          <w:tblCellMar>
-            <w:top w:w="0" w:type="dxa"/>
-            <w:bottom w:w="0" w:type="dxa"/>
-          </w:tblCellMar>
-        </w:tblPrEx>
         <w:tc>
           <w:tcPr>
             <w:tcW w:w="500" w:type="dxa"/>
@@ -197,12 +191,6 @@
         </w:tc>
       </w:tr>
       <w:tr>
-        <w:tblPrEx>
-          <w:tblCellMar>
-            <w:top w:w="0" w:type="dxa"/>
-            <w:bottom w:w="0" w:type="dxa"/>
-          </w:tblCellMar>
-        </w:tblPrEx>
         <w:tc>
           <w:tcPr>
             <w:tcW w:w="500" w:type="dxa"/>
@@ -290,12 +278,6 @@
         </w:tc>
       </w:tr>
       <w:tr>
-        <w:tblPrEx>
-          <w:tblCellMar>
-            <w:top w:w="0" w:type="dxa"/>
-            <w:bottom w:w="0" w:type="dxa"/>
-          </w:tblCellMar>
-        </w:tblPrEx>
         <w:tc>
           <w:tcPr>
             <w:tcW w:w="500" w:type="dxa"/>
@@ -383,12 +365,6 @@
         </w:tc>
       </w:tr>
       <w:tr>
-        <w:tblPrEx>
-          <w:tblCellMar>
-            <w:top w:w="0" w:type="dxa"/>
-            <w:bottom w:w="0" w:type="dxa"/>
-          </w:tblCellMar>
-        </w:tblPrEx>
         <w:tc>
           <w:tcPr>
             <w:tcW w:w="500" w:type="dxa"/>
@@ -476,12 +452,6 @@
         </w:tc>
       </w:tr>
       <w:tr>
-        <w:tblPrEx>
-          <w:tblCellMar>
-            <w:top w:w="0" w:type="dxa"/>
-            <w:bottom w:w="0" w:type="dxa"/>
-          </w:tblCellMar>
-        </w:tblPrEx>
         <w:tc>
           <w:tcPr>
             <w:tcW w:w="500" w:type="dxa"/>
@@ -569,12 +539,6 @@
         </w:tc>
       </w:tr>
       <w:tr>
-        <w:tblPrEx>
-          <w:tblCellMar>
-            <w:top w:w="0" w:type="dxa"/>
-            <w:bottom w:w="0" w:type="dxa"/>
-          </w:tblCellMar>
-        </w:tblPrEx>
         <w:tc>
           <w:tcPr>
             <w:tcW w:w="500" w:type="dxa"/>
@@ -662,12 +626,6 @@
         </w:tc>
       </w:tr>
       <w:tr>
-        <w:tblPrEx>
-          <w:tblCellMar>
-            <w:top w:w="0" w:type="dxa"/>
-            <w:bottom w:w="0" w:type="dxa"/>
-          </w:tblCellMar>
-        </w:tblPrEx>
         <w:tc>
           <w:tcPr>
             <w:tcW w:w="500" w:type="dxa"/>
@@ -798,12 +756,6 @@
         <w:gridCol w:w="4460"/>
       </w:tblGrid>
       <w:tr>
-        <w:tblPrEx>
-          <w:tblCellMar>
-            <w:top w:w="0" w:type="dxa"/>
-            <w:bottom w:w="0" w:type="dxa"/>
-          </w:tblCellMar>
-        </w:tblPrEx>
         <w:tc>
           <w:tcPr>
             <w:tcW w:w="500" w:type="dxa"/>
@@ -896,12 +848,6 @@
         </w:tc>
       </w:tr>
       <w:tr>
-        <w:tblPrEx>
-          <w:tblCellMar>
-            <w:top w:w="0" w:type="dxa"/>
-            <w:bottom w:w="0" w:type="dxa"/>
-          </w:tblCellMar>
-        </w:tblPrEx>
         <w:tc>
           <w:tcPr>
             <w:tcW w:w="500" w:type="dxa"/>
@@ -989,12 +935,6 @@
         </w:tc>
       </w:tr>
       <w:tr>
-        <w:tblPrEx>
-          <w:tblCellMar>
-            <w:top w:w="0" w:type="dxa"/>
-            <w:bottom w:w="0" w:type="dxa"/>
-          </w:tblCellMar>
-        </w:tblPrEx>
         <w:tc>
           <w:tcPr>
             <w:tcW w:w="500" w:type="dxa"/>
@@ -1082,12 +1022,6 @@
         </w:tc>
       </w:tr>
       <w:tr>
-        <w:tblPrEx>
-          <w:tblCellMar>
-            <w:top w:w="0" w:type="dxa"/>
-            <w:bottom w:w="0" w:type="dxa"/>
-          </w:tblCellMar>
-        </w:tblPrEx>
         <w:tc>
           <w:tcPr>
             <w:tcW w:w="500" w:type="dxa"/>
@@ -1175,12 +1109,6 @@
         </w:tc>
       </w:tr>
       <w:tr>
-        <w:tblPrEx>
-          <w:tblCellMar>
-            <w:top w:w="0" w:type="dxa"/>
-            <w:bottom w:w="0" w:type="dxa"/>
-          </w:tblCellMar>
-        </w:tblPrEx>
         <w:tc>
           <w:tcPr>
             <w:tcW w:w="500" w:type="dxa"/>
@@ -1328,12 +1256,6 @@
         <w:gridCol w:w="4460"/>
       </w:tblGrid>
       <w:tr>
-        <w:tblPrEx>
-          <w:tblCellMar>
-            <w:top w:w="0" w:type="dxa"/>
-            <w:bottom w:w="0" w:type="dxa"/>
-          </w:tblCellMar>
-        </w:tblPrEx>
         <w:tc>
           <w:tcPr>
             <w:tcW w:w="500" w:type="dxa"/>
@@ -1426,12 +1348,6 @@
         </w:tc>
       </w:tr>
       <w:tr>
-        <w:tblPrEx>
-          <w:tblCellMar>
-            <w:top w:w="0" w:type="dxa"/>
-            <w:bottom w:w="0" w:type="dxa"/>
-          </w:tblCellMar>
-        </w:tblPrEx>
         <w:tc>
           <w:tcPr>
             <w:tcW w:w="500" w:type="dxa"/>
@@ -1519,12 +1435,6 @@
         </w:tc>
       </w:tr>
       <w:tr>
-        <w:tblPrEx>
-          <w:tblCellMar>
-            <w:top w:w="0" w:type="dxa"/>
-            <w:bottom w:w="0" w:type="dxa"/>
-          </w:tblCellMar>
-        </w:tblPrEx>
         <w:tc>
           <w:tcPr>
             <w:tcW w:w="500" w:type="dxa"/>
@@ -1612,12 +1522,6 @@
         </w:tc>
       </w:tr>
       <w:tr>
-        <w:tblPrEx>
-          <w:tblCellMar>
-            <w:top w:w="0" w:type="dxa"/>
-            <w:bottom w:w="0" w:type="dxa"/>
-          </w:tblCellMar>
-        </w:tblPrEx>
         <w:tc>
           <w:tcPr>
             <w:tcW w:w="500" w:type="dxa"/>
@@ -1705,12 +1609,6 @@
         </w:tc>
       </w:tr>
       <w:tr>
-        <w:tblPrEx>
-          <w:tblCellMar>
-            <w:top w:w="0" w:type="dxa"/>
-            <w:bottom w:w="0" w:type="dxa"/>
-          </w:tblCellMar>
-        </w:tblPrEx>
         <w:tc>
           <w:tcPr>
             <w:tcW w:w="500" w:type="dxa"/>
@@ -1869,12 +1767,6 @@
         <w:gridCol w:w="6614"/>
       </w:tblGrid>
       <w:tr>
-        <w:tblPrEx>
-          <w:tblCellMar>
-            <w:top w:w="0" w:type="dxa"/>
-            <w:bottom w:w="0" w:type="dxa"/>
-          </w:tblCellMar>
-        </w:tblPrEx>
         <w:tc>
           <w:tcPr>
             <w:tcW w:w="3000" w:type="dxa"/>
@@ -1937,12 +1829,6 @@
         </w:tc>
       </w:tr>
       <w:tr>
-        <w:tblPrEx>
-          <w:tblCellMar>
-            <w:top w:w="0" w:type="dxa"/>
-            <w:bottom w:w="0" w:type="dxa"/>
-          </w:tblCellMar>
-        </w:tblPrEx>
         <w:tc>
           <w:tcPr>
             <w:tcW w:w="3000" w:type="dxa"/>
@@ -2002,12 +1888,6 @@
         </w:tc>
       </w:tr>
       <w:tr>
-        <w:tblPrEx>
-          <w:tblCellMar>
-            <w:top w:w="0" w:type="dxa"/>
-            <w:bottom w:w="0" w:type="dxa"/>
-          </w:tblCellMar>
-        </w:tblPrEx>
         <w:tc>
           <w:tcPr>
             <w:tcW w:w="3000" w:type="dxa"/>
@@ -2067,12 +1947,6 @@
         </w:tc>
       </w:tr>
       <w:tr>
-        <w:tblPrEx>
-          <w:tblCellMar>
-            <w:top w:w="0" w:type="dxa"/>
-            <w:bottom w:w="0" w:type="dxa"/>
-          </w:tblCellMar>
-        </w:tblPrEx>
         <w:tc>
           <w:tcPr>
             <w:tcW w:w="3000" w:type="dxa"/>
@@ -2175,12 +2049,6 @@
         <w:gridCol w:w="4460"/>
       </w:tblGrid>
       <w:tr>
-        <w:tblPrEx>
-          <w:tblCellMar>
-            <w:top w:w="0" w:type="dxa"/>
-            <w:bottom w:w="0" w:type="dxa"/>
-          </w:tblCellMar>
-        </w:tblPrEx>
         <w:tc>
           <w:tcPr>
             <w:tcW w:w="500" w:type="dxa"/>
@@ -2273,12 +2141,6 @@
         </w:tc>
       </w:tr>
       <w:tr>
-        <w:tblPrEx>
-          <w:tblCellMar>
-            <w:top w:w="0" w:type="dxa"/>
-            <w:bottom w:w="0" w:type="dxa"/>
-          </w:tblCellMar>
-        </w:tblPrEx>
         <w:tc>
           <w:tcPr>
             <w:tcW w:w="500" w:type="dxa"/>
@@ -2366,12 +2228,6 @@
         </w:tc>
       </w:tr>
       <w:tr>
-        <w:tblPrEx>
-          <w:tblCellMar>
-            <w:top w:w="0" w:type="dxa"/>
-            <w:bottom w:w="0" w:type="dxa"/>
-          </w:tblCellMar>
-        </w:tblPrEx>
         <w:tc>
           <w:tcPr>
             <w:tcW w:w="500" w:type="dxa"/>
@@ -2482,12 +2338,6 @@
         <w:gridCol w:w="6960"/>
       </w:tblGrid>
       <w:tr>
-        <w:tblPrEx>
-          <w:tblCellMar>
-            <w:top w:w="0" w:type="dxa"/>
-            <w:bottom w:w="0" w:type="dxa"/>
-          </w:tblCellMar>
-        </w:tblPrEx>
         <w:tc>
           <w:tcPr>
             <w:tcW w:w="2400" w:type="dxa"/>
@@ -2550,12 +2400,6 @@
         </w:tc>
       </w:tr>
       <w:tr>
-        <w:tblPrEx>
-          <w:tblCellMar>
-            <w:top w:w="0" w:type="dxa"/>
-            <w:bottom w:w="0" w:type="dxa"/>
-          </w:tblCellMar>
-        </w:tblPrEx>
         <w:tc>
           <w:tcPr>
             <w:tcW w:w="2400" w:type="dxa"/>
@@ -2615,12 +2459,6 @@
         </w:tc>
       </w:tr>
       <w:tr>
-        <w:tblPrEx>
-          <w:tblCellMar>
-            <w:top w:w="0" w:type="dxa"/>
-            <w:bottom w:w="0" w:type="dxa"/>
-          </w:tblCellMar>
-        </w:tblPrEx>
         <w:tc>
           <w:tcPr>
             <w:tcW w:w="2400" w:type="dxa"/>
@@ -2680,12 +2518,6 @@
         </w:tc>
       </w:tr>
       <w:tr>
-        <w:tblPrEx>
-          <w:tblCellMar>
-            <w:top w:w="0" w:type="dxa"/>
-            <w:bottom w:w="0" w:type="dxa"/>
-          </w:tblCellMar>
-        </w:tblPrEx>
         <w:tc>
           <w:tcPr>
             <w:tcW w:w="2400" w:type="dxa"/>
@@ -2745,12 +2577,6 @@
         </w:tc>
       </w:tr>
       <w:tr>
-        <w:tblPrEx>
-          <w:tblCellMar>
-            <w:top w:w="0" w:type="dxa"/>
-            <w:bottom w:w="0" w:type="dxa"/>
-          </w:tblCellMar>
-        </w:tblPrEx>
         <w:tc>
           <w:tcPr>
             <w:tcW w:w="2400" w:type="dxa"/>
@@ -2865,12 +2691,6 @@
         <w:gridCol w:w="4460"/>
       </w:tblGrid>
       <w:tr>
-        <w:tblPrEx>
-          <w:tblCellMar>
-            <w:top w:w="0" w:type="dxa"/>
-            <w:bottom w:w="0" w:type="dxa"/>
-          </w:tblCellMar>
-        </w:tblPrEx>
         <w:tc>
           <w:tcPr>
             <w:tcW w:w="500" w:type="dxa"/>
@@ -2963,12 +2783,6 @@
         </w:tc>
       </w:tr>
       <w:tr>
-        <w:tblPrEx>
-          <w:tblCellMar>
-            <w:top w:w="0" w:type="dxa"/>
-            <w:bottom w:w="0" w:type="dxa"/>
-          </w:tblCellMar>
-        </w:tblPrEx>
         <w:tc>
           <w:tcPr>
             <w:tcW w:w="500" w:type="dxa"/>
@@ -3056,12 +2870,6 @@
         </w:tc>
       </w:tr>
       <w:tr>
-        <w:tblPrEx>
-          <w:tblCellMar>
-            <w:top w:w="0" w:type="dxa"/>
-            <w:bottom w:w="0" w:type="dxa"/>
-          </w:tblCellMar>
-        </w:tblPrEx>
         <w:tc>
           <w:tcPr>
             <w:tcW w:w="500" w:type="dxa"/>
@@ -3150,12 +2958,6 @@
         </w:tc>
       </w:tr>
       <w:tr>
-        <w:tblPrEx>
-          <w:tblCellMar>
-            <w:top w:w="0" w:type="dxa"/>
-            <w:bottom w:w="0" w:type="dxa"/>
-          </w:tblCellMar>
-        </w:tblPrEx>
         <w:tc>
           <w:tcPr>
             <w:tcW w:w="500" w:type="dxa"/>
@@ -3243,12 +3045,6 @@
         </w:tc>
       </w:tr>
       <w:tr>
-        <w:tblPrEx>
-          <w:tblCellMar>
-            <w:top w:w="0" w:type="dxa"/>
-            <w:bottom w:w="0" w:type="dxa"/>
-          </w:tblCellMar>
-        </w:tblPrEx>
         <w:tc>
           <w:tcPr>
             <w:tcW w:w="500" w:type="dxa"/>
@@ -3379,12 +3175,6 @@
         <w:gridCol w:w="4460"/>
       </w:tblGrid>
       <w:tr>
-        <w:tblPrEx>
-          <w:tblCellMar>
-            <w:top w:w="0" w:type="dxa"/>
-            <w:bottom w:w="0" w:type="dxa"/>
-          </w:tblCellMar>
-        </w:tblPrEx>
         <w:tc>
           <w:tcPr>
             <w:tcW w:w="500" w:type="dxa"/>
@@ -3477,12 +3267,6 @@
         </w:tc>
       </w:tr>
       <w:tr>
-        <w:tblPrEx>
-          <w:tblCellMar>
-            <w:top w:w="0" w:type="dxa"/>
-            <w:bottom w:w="0" w:type="dxa"/>
-          </w:tblCellMar>
-        </w:tblPrEx>
         <w:tc>
           <w:tcPr>
             <w:tcW w:w="500" w:type="dxa"/>
@@ -3570,12 +3354,6 @@
         </w:tc>
       </w:tr>
       <w:tr>
-        <w:tblPrEx>
-          <w:tblCellMar>
-            <w:top w:w="0" w:type="dxa"/>
-            <w:bottom w:w="0" w:type="dxa"/>
-          </w:tblCellMar>
-        </w:tblPrEx>
         <w:tc>
           <w:tcPr>
             <w:tcW w:w="500" w:type="dxa"/>
@@ -3775,12 +3553,6 @@
         <w:gridCol w:w="9360"/>
       </w:tblGrid>
       <w:tr>
-        <w:tblPrEx>
-          <w:tblCellMar>
-            <w:top w:w="0" w:type="dxa"/>
-            <w:bottom w:w="0" w:type="dxa"/>
-          </w:tblCellMar>
-        </w:tblPrEx>
         <w:tc>
           <w:tcPr>
             <w:tcW w:w="9360" w:type="dxa"/>
@@ -4115,12 +3887,6 @@
         <w:gridCol w:w="2877"/>
       </w:tblGrid>
       <w:tr>
-        <w:tblPrEx>
-          <w:tblCellMar>
-            <w:top w:w="0" w:type="dxa"/>
-            <w:bottom w:w="0" w:type="dxa"/>
-          </w:tblCellMar>
-        </w:tblPrEx>
         <w:tc>
           <w:tcPr>
             <w:tcW w:w="2800" w:type="dxa"/>
@@ -4213,12 +3979,6 @@
         </w:tc>
       </w:tr>
       <w:tr>
-        <w:tblPrEx>
-          <w:tblCellMar>
-            <w:top w:w="0" w:type="dxa"/>
-            <w:bottom w:w="0" w:type="dxa"/>
-          </w:tblCellMar>
-        </w:tblPrEx>
         <w:tc>
           <w:tcPr>
             <w:tcW w:w="2800" w:type="dxa"/>
@@ -4306,12 +4066,6 @@
         </w:tc>
       </w:tr>
       <w:tr>
-        <w:tblPrEx>
-          <w:tblCellMar>
-            <w:top w:w="0" w:type="dxa"/>
-            <w:bottom w:w="0" w:type="dxa"/>
-          </w:tblCellMar>
-        </w:tblPrEx>
         <w:tc>
           <w:tcPr>
             <w:tcW w:w="2800" w:type="dxa"/>
@@ -4399,12 +4153,6 @@
         </w:tc>
       </w:tr>
       <w:tr>
-        <w:tblPrEx>
-          <w:tblCellMar>
-            <w:top w:w="0" w:type="dxa"/>
-            <w:bottom w:w="0" w:type="dxa"/>
-          </w:tblCellMar>
-        </w:tblPrEx>
         <w:tc>
           <w:tcPr>
             <w:tcW w:w="2800" w:type="dxa"/>
@@ -4492,12 +4240,6 @@
         </w:tc>
       </w:tr>
       <w:tr>
-        <w:tblPrEx>
-          <w:tblCellMar>
-            <w:top w:w="0" w:type="dxa"/>
-            <w:bottom w:w="0" w:type="dxa"/>
-          </w:tblCellMar>
-        </w:tblPrEx>
         <w:tc>
           <w:tcPr>
             <w:tcW w:w="2800" w:type="dxa"/>
@@ -4585,12 +4327,6 @@
         </w:tc>
       </w:tr>
       <w:tr>
-        <w:tblPrEx>
-          <w:tblCellMar>
-            <w:top w:w="0" w:type="dxa"/>
-            <w:bottom w:w="0" w:type="dxa"/>
-          </w:tblCellMar>
-        </w:tblPrEx>
         <w:tc>
           <w:tcPr>
             <w:tcW w:w="2800" w:type="dxa"/>
@@ -4678,12 +4414,6 @@
         </w:tc>
       </w:tr>
       <w:tr>
-        <w:tblPrEx>
-          <w:tblCellMar>
-            <w:top w:w="0" w:type="dxa"/>
-            <w:bottom w:w="0" w:type="dxa"/>
-          </w:tblCellMar>
-        </w:tblPrEx>
         <w:tc>
           <w:tcPr>
             <w:tcW w:w="2800" w:type="dxa"/>
@@ -4771,12 +4501,6 @@
         </w:tc>
       </w:tr>
       <w:tr>
-        <w:tblPrEx>
-          <w:tblCellMar>
-            <w:top w:w="0" w:type="dxa"/>
-            <w:bottom w:w="0" w:type="dxa"/>
-          </w:tblCellMar>
-        </w:tblPrEx>
         <w:tc>
           <w:tcPr>
             <w:tcW w:w="2800" w:type="dxa"/>
@@ -4865,12 +4589,6 @@
         </w:tc>
       </w:tr>
       <w:tr>
-        <w:tblPrEx>
-          <w:tblCellMar>
-            <w:top w:w="0" w:type="dxa"/>
-            <w:bottom w:w="0" w:type="dxa"/>
-          </w:tblCellMar>
-        </w:tblPrEx>
         <w:tc>
           <w:tcPr>
             <w:tcW w:w="2800" w:type="dxa"/>
@@ -5000,12 +4718,6 @@
         <w:gridCol w:w="6960"/>
       </w:tblGrid>
       <w:tr>
-        <w:tblPrEx>
-          <w:tblCellMar>
-            <w:top w:w="0" w:type="dxa"/>
-            <w:bottom w:w="0" w:type="dxa"/>
-          </w:tblCellMar>
-        </w:tblPrEx>
         <w:tc>
           <w:tcPr>
             <w:tcW w:w="2400" w:type="dxa"/>
@@ -5066,12 +4778,6 @@
         </w:tc>
       </w:tr>
       <w:tr>
-        <w:tblPrEx>
-          <w:tblCellMar>
-            <w:top w:w="0" w:type="dxa"/>
-            <w:bottom w:w="0" w:type="dxa"/>
-          </w:tblCellMar>
-        </w:tblPrEx>
         <w:tc>
           <w:tcPr>
             <w:tcW w:w="2400" w:type="dxa"/>
@@ -5130,12 +4836,6 @@
         </w:tc>
       </w:tr>
       <w:tr>
-        <w:tblPrEx>
-          <w:tblCellMar>
-            <w:top w:w="0" w:type="dxa"/>
-            <w:bottom w:w="0" w:type="dxa"/>
-          </w:tblCellMar>
-        </w:tblPrEx>
         <w:tc>
           <w:tcPr>
             <w:tcW w:w="2400" w:type="dxa"/>
@@ -5194,12 +4894,6 @@
         </w:tc>
       </w:tr>
       <w:tr>
-        <w:tblPrEx>
-          <w:tblCellMar>
-            <w:top w:w="0" w:type="dxa"/>
-            <w:bottom w:w="0" w:type="dxa"/>
-          </w:tblCellMar>
-        </w:tblPrEx>
         <w:tc>
           <w:tcPr>
             <w:tcW w:w="2400" w:type="dxa"/>
@@ -5258,7 +4952,22 @@
         </w:tc>
       </w:tr>
     </w:tbl>
-    <w:p/>
+    <w:p>
+      <w:pPr>
+        <w:rPr>
+          <w:color w:val="000000" w:themeColor="text1"/>
+        </w:rPr>
+      </w:pPr>
+      <w:r>
+        <w:rPr>
+          <w:rFonts w:ascii="Menlo" w:hAnsi="Menlo" w:cs="Menlo"/>
+          <w:color w:val="000000" w:themeColor="text1"/>
+          <w:sz w:val="24"/>
+          <w:szCs w:val="24"/>
+        </w:rPr>
+        <w:t>https://accounts.google.com/SignOutOptions?hl=en&amp;continue=https://mail.google.com/mail&amp;service=mail&amp;ec=GBRAFw</w:t>
+      </w:r>
+    </w:p>
     <w:sectPr>
       <w:headerReference w:type="default" r:id="rId7"/>
       <w:footerReference w:type="default" r:id="rId8"/>

</xml_diff>